<commit_message>
paper: Fig. 1's labels no longer spill over their boxes
Authoring the figures at their printed width fixed the type size, but Fig. 1 is
a schematic, not a plot: its boxes are drawn in data units and scale with the
canvas while the labels stay in points. Narrowing the canvas to 2.45 inches left
"(AST, imports)" and "analysis L1-L4" hanging past their borders, on top of the
arrows they were meant to sit beside. Figs. 2 and 3 were unaffected -- matplotlib
lays out axes content itself.

Labels shortened to what fits, boxes widened to the most four-across allows, and
a check that measures each rendered label against its box and refuses to write
the PNG if one overflows. Without it the next person to touch COL_W gets a
figure that is wrong but still looks plausible at thumbnail size, which is how
this survived review in the first place.

The caption also claimed the two annotations were dashed. They are italic.
</commit_message>
<xml_diff>
--- a/paper/ArchGuard_IEEE_paper.docx
+++ b/paper/ArchGuard_IEEE_paper.docx
@@ -529,7 +529,7 @@
         <w:drawing>
           <wp:inline distT="0" distB="0" distL="0" distR="0">
             <wp:extent cx="2240280" cy="1473868"/>
-            <wp:docPr id="3197" name="Figure rIdFig1"/>
+            <wp:docPr id="7441" name="Figure rIdFig1"/>
             <a:graphic xmlns:a="http://purl.oclc.org/ooxml/drawingml/main">
               <a:graphicData uri="http://purl.oclc.org/ooxml/drawingml/picture">
                 <pic:pic xmlns:pic="http://purl.oclc.org/ooxml/drawingml/picture">
@@ -564,7 +564,7 @@
         <w:pStyle w:val="figurecaption"/>
       </w:pPr>
       <w:r>
-        <w:t xml:space="preserve">Analysis pipeline. Dashed labels mark the two inference inputs: version history for module boundaries and embeddings for the semantic layers.</w:t>
+        <w:t xml:space="preserve">Analysis pipeline. Italic labels mark the two inference inputs: version history for module boundaries and embeddings for the semantic layers. The score is the mean over active layers only.</w:t>
       </w:r>
     </w:p>
     <w:p>
@@ -2792,7 +2792,7 @@
         <w:drawing>
           <wp:inline distT="0" distB="0" distL="0" distR="0">
             <wp:extent cx="2240280" cy="1408363"/>
-            <wp:docPr id="4951" name="Figure rIdFig2"/>
+            <wp:docPr id="8928" name="Figure rIdFig2"/>
             <a:graphic xmlns:a="http://purl.oclc.org/ooxml/drawingml/main">
               <a:graphicData uri="http://purl.oclc.org/ooxml/drawingml/picture">
                 <pic:pic xmlns:pic="http://purl.oclc.org/ooxml/drawingml/picture">
@@ -2864,7 +2864,7 @@
         <w:drawing>
           <wp:inline distT="0" distB="0" distL="0" distR="0">
             <wp:extent cx="2240280" cy="1408363"/>
-            <wp:docPr id="8138" name="Figure rIdFig3"/>
+            <wp:docPr id="6609" name="Figure rIdFig3"/>
             <a:graphic xmlns:a="http://purl.oclc.org/ooxml/drawingml/main">
               <a:graphicData uri="http://purl.oclc.org/ooxml/drawingml/picture">
                 <pic:pic xmlns:pic="http://purl.oclc.org/ooxml/drawingml/picture">

</xml_diff>